<commit_message>
docs(launch): clarify PostHog dashboard rollout
</commit_message>
<xml_diff>
--- a/docs/handoff.docx
+++ b/docs/handoff.docx
@@ -705,7 +705,7 @@
                 <w:color w:val="1F2933"/>
                 <w:sz w:val="20"/>
               </w:rPr>
-              <w:t>Plausible + PostHog (region/referrer/device/utm super-properties)</w:t>
+              <w:t>Plausible + PostHog (referrer/device/utm super-properties)</w:t>
             </w:r>
           </w:p>
         </w:tc>
@@ -1563,7 +1563,7 @@
                 <w:color w:val="1F2933"/>
                 <w:sz w:val="20"/>
               </w:rPr>
-              <w:t>8 — SEO + personalization + analytics</w:t>
+              <w:t>8 — SEO + analytics</w:t>
             </w:r>
           </w:p>
         </w:tc>
@@ -1585,7 +1585,7 @@
                 <w:color w:val="1F2933"/>
                 <w:sz w:val="20"/>
               </w:rPr>
-              <w:t>Sitemap, robots, region middleware, PostHog taxonomy</w:t>
+              <w:t>Sitemap, robots, PostHog taxonomy; retired region middleware</w:t>
             </w:r>
           </w:p>
         </w:tc>
@@ -3584,7 +3584,7 @@
                 <w:color w:val="1F2933"/>
                 <w:sz w:val="20"/>
               </w:rPr>
-              <w:t>Gated PDF download</w:t>
+              <w:t>Route scaffold; no live slug while INSIGHTS.whitepapers is empty</w:t>
             </w:r>
           </w:p>
         </w:tc>
@@ -5137,7 +5137,7 @@
                 <w:color w:val="1F2933"/>
                 <w:sz w:val="20"/>
               </w:rPr>
-              <w:t>docs/design-system/components/*.mdx (19 components)</w:t>
+              <w:t>docs/design-system/components/\*.mdx (19 components)</w:t>
             </w:r>
           </w:p>
         </w:tc>
@@ -5515,7 +5515,7 @@
                 <w:color w:val="1F2933"/>
                 <w:sz w:val="20"/>
               </w:rPr>
-              <w:t>First-Load JS at most 450 kB per route, excluding API and image-generation routes</w:t>
+              <w:t>First-Load JS at most 350 kB per route, excluding API, dashboard, Studio, and image-generation routes</w:t>
             </w:r>
           </w:p>
         </w:tc>
@@ -5595,7 +5595,7 @@
           <w:color w:val="1F2933"/>
           <w:sz w:val="22"/>
         </w:rPr>
-        <w:t>The bundle budget was ratcheted from 475 kB to 450 kB after the AI surface dynamic-import work; further ratcheting toward the 350 kB long-term target is a recorded follow-up.</w:t>
+        <w:t>The bundle budget was ratcheted from 475 kB to 450 kB after the AI surface dynamic-import work, then to 380 kB after the PDF subpath import cleanup removed pdf-lib from the Dosage Matcher and DEL Readiness client route chunks. A follow-up homepage shared-chunk pass kept draft-only visual editing behind a draft-mode import and removed Framer Motion from the site-wide Concierge launcher. The June 2026 homepage motion/component audit then moved static homepage sections out of client islands, split hero CTA analytics into a small client component, and replaced the process scroll animation with a server-rendered timeline. / now measures 346 kB First-Load JS, so the CI budget is ratcheted to 350 kB.</w:t>
       </w:r>
     </w:p>
     <w:p>
@@ -5635,30 +5635,6 @@
           <w:color w:val="1F2933"/>
           <w:sz w:val="22"/>
         </w:rPr>
-        <w:t>Lazy-split /ai/dosage-matcher and /ai/del-readiness (now the new worst-bundle routes at 431 and 429 kB respectively). Both use hand-rolled stream parsers; lazy-splitting their pdf-lib plus multi-step form chunks would close the gap.</w:t>
-      </w:r>
-    </w:p>
-    <w:p>
-      <w:pPr>
-        <w:pStyle w:val="ListBullet"/>
-      </w:pPr>
-      <w:r>
-        <w:rPr>
-          <w:color w:val="1F2933"/>
-          <w:sz w:val="22"/>
-        </w:rPr>
-        <w:t>Defer Cloudflare Turnstile until first form focus on /contact to close the four demoted Lighthouse warns from the demote chain. Cal.com is already an iframe so no further deferral is available there.</w:t>
-      </w:r>
-    </w:p>
-    <w:p>
-      <w:pPr>
-        <w:pStyle w:val="ListBullet"/>
-      </w:pPr>
-      <w:r>
-        <w:rPr>
-          <w:color w:val="1F2933"/>
-          <w:sz w:val="22"/>
-        </w:rPr>
         <w:t>Promote Lighthouse categories:accessibility warn to error 1.0 after the manual VoiceOver and NVDA assistive-tech pass per docs/accessibility-at-test-plan.md.</w:t>
       </w:r>
     </w:p>
@@ -5671,7 +5647,7 @@
           <w:color w:val="1F2933"/>
           <w:sz w:val="22"/>
         </w:rPr>
-        <w:t>Per-route OG images for case-studies/[slug], industries/[slug], services dynamic leaves, and /ai/* tools.</w:t>
+        <w:t>Add /insights/whitepapers/[slug] to the axe URL list after a live whitepaper slug returns to INSIGHTS.whitepapers.</w:t>
       </w:r>
     </w:p>
     <w:p>
@@ -5683,79 +5659,7 @@
           <w:color w:val="1F2933"/>
           <w:sz w:val="22"/>
         </w:rPr>
-        <w:t>Touch-target uplift to 44 by 44 on the Concierge send button, header Region switcher, and Button size="sm".</w:t>
-      </w:r>
-    </w:p>
-    <w:p>
-      <w:pPr>
-        <w:pStyle w:val="ListBullet"/>
-      </w:pPr>
-      <w:r>
-        <w:rPr>
-          <w:color w:val="1F2933"/>
-          <w:sz w:val="22"/>
-        </w:rPr>
-        <w:t>Field-level aria-invalid on InquiryForm and WhitepaperGateForm (currently form-level errors only).</w:t>
-      </w:r>
-    </w:p>
-    <w:p>
-      <w:pPr>
-        <w:pStyle w:val="ListBullet"/>
-      </w:pPr>
-      <w:r>
-        <w:rPr>
-          <w:color w:val="1F2933"/>
-          <w:sz w:val="22"/>
-        </w:rPr>
-        <w:t>Forced-colors mode media queries.</w:t>
-      </w:r>
-    </w:p>
-    <w:p>
-      <w:pPr>
-        <w:pStyle w:val="ListBullet"/>
-      </w:pPr>
-      <w:r>
-        <w:rPr>
-          <w:color w:val="1F2933"/>
-          <w:sz w:val="22"/>
-        </w:rPr>
-        <w:t>Refactor inline buildDetailJsonLd functions onto the @propharmex/lib schema helpers.</w:t>
-      </w:r>
-    </w:p>
-    <w:p>
-      <w:pPr>
-        <w:pStyle w:val="ListBullet"/>
-      </w:pPr>
-      <w:r>
-        <w:rPr>
-          <w:color w:val="1F2933"/>
-          <w:sz w:val="22"/>
-        </w:rPr>
-        <w:t>Resolve parsers.ts::zSopCapability Zod-schema drift left from Prompt 21.</w:t>
-      </w:r>
-    </w:p>
-    <w:p>
-      <w:pPr>
-        <w:pStyle w:val="ListBullet"/>
-      </w:pPr>
-      <w:r>
-        <w:rPr>
-          <w:color w:val="1F2933"/>
-          <w:sz w:val="22"/>
-        </w:rPr>
-        <w:t>Add /insights/whitepapers/[slug] to the axe URL list.</w:t>
-      </w:r>
-    </w:p>
-    <w:p>
-      <w:pPr>
-        <w:pStyle w:val="ListBullet"/>
-      </w:pPr>
-      <w:r>
-        <w:rPr>
-          <w:color w:val="1F2933"/>
-          <w:sz w:val="22"/>
-        </w:rPr>
-        <w:t>Build the four PostHog dashboards in the PostHog UI per docs/analytics-taxonomy.md section 6 (Lead funnel, AI tool conversion, Content performance, Region breakdown).</w:t>
+        <w:t>Build the three PostHog dashboards in the PostHog UI per docs/posthog-dashboard-build-sheet.md (Lead funnel, AI tool conversion, Content performance). The earlier Region breakdown dashboard is retired with the region middleware.</w:t>
       </w:r>
     </w:p>
     <w:p>
@@ -6072,7 +5976,7 @@
                 <w:color w:val="1F2933"/>
                 <w:sz w:val="20"/>
               </w:rPr>
-              <w:t>packages/lib/sanity/schemas/ + apps/studio/schemas/</w:t>
+              <w:t>packages/lib/sanity/schemas/ + apps/web/sanity/schemas/ (Studio is embedded at /studio inside apps/web — see PR-L′)</w:t>
             </w:r>
           </w:p>
         </w:tc>
@@ -6256,7 +6160,7 @@
                 <w:color w:val="1F2933"/>
                 <w:sz w:val="20"/>
               </w:rPr>
-              <w:t>.github/workflows/ + scripts/check-*.mjs</w:t>
+              <w:t>.github/workflows/ + scripts/check-\*.mjs</w:t>
             </w:r>
           </w:p>
         </w:tc>
@@ -6825,7 +6729,7 @@
                 <w:color w:val="1F2933"/>
                 <w:sz w:val="20"/>
               </w:rPr>
-              <w:t>Per docs/analytics-taxonomy.md section 6</w:t>
+              <w:t>Per docs/posthog-dashboard-build-sheet.md</w:t>
             </w:r>
           </w:p>
         </w:tc>

</xml_diff>